<commit_message>
Guide Word : téléchargement, impression et tampon
Co-Authored-By: Claude Opus 5.5 <noreply@anthropic.com>
Claude-Session: https://claude.ai/code/session_01G1LebbzjQJAtdp5rB66QoL
</commit_message>
<xml_diff>
--- a/docs/Docubus_guide.docx
+++ b/docs/Docubus_guide.docx
@@ -1417,7 +1417,7 @@
         <w:t xml:space="preserve">date d’ajout</w:t>
       </w:r>
       <w:r>
-        <w:t xml:space="preserve"> et, s’il a été remplacé depuis, sa date de mise à jour. Deux boutons sont proposés :</w:t>
+        <w:t xml:space="preserve"> et, s’il a été remplacé depuis, sa date de mise à jour. Plusieurs boutons sont proposés :</w:t>
       </w:r>
     </w:p>
     <w:tbl>
@@ -1570,6 +1570,106 @@
                 <w:b/>
                 <w:bCs/>
               </w:rPr>
+              <w:t xml:space="preserve">Télécharger</w:t>
+            </w:r>
+          </w:p>
+        </w:tc>
+        <w:tc>
+          <w:tcPr>
+            <w:tcW w:type="dxa" w:w="7238"/>
+            <w:tcBorders>
+              <w:top w:val="single" w:color="B9C2D3" w:sz="6"/>
+              <w:left w:val="single" w:color="B9C2D3" w:sz="6"/>
+              <w:bottom w:val="single" w:color="B9C2D3" w:sz="6"/>
+              <w:right w:val="single" w:color="B9C2D3" w:sz="6"/>
+            </w:tcBorders>
+            <w:tcMar>
+              <w:top w:type="dxa" w:w="80"/>
+              <w:left w:type="dxa" w:w="120"/>
+              <w:bottom w:type="dxa" w:w="80"/>
+              <w:right w:type="dxa" w:w="120"/>
+            </w:tcMar>
+          </w:tcPr>
+          <w:p>
+            <w:r>
+              <w:t xml:space="preserve">Enregistre le fichier sur le téléphone (dossier Fichiers ou Téléchargements) ou sur l’ordinateur.</w:t>
+            </w:r>
+          </w:p>
+        </w:tc>
+      </w:tr>
+      <w:tr>
+        <w:tc>
+          <w:tcPr>
+            <w:tcW w:type="dxa" w:w="2400"/>
+            <w:tcBorders>
+              <w:top w:val="single" w:color="B9C2D3" w:sz="6"/>
+              <w:left w:val="single" w:color="B9C2D3" w:sz="6"/>
+              <w:bottom w:val="single" w:color="B9C2D3" w:sz="6"/>
+              <w:right w:val="single" w:color="B9C2D3" w:sz="6"/>
+            </w:tcBorders>
+            <w:tcMar>
+              <w:top w:type="dxa" w:w="80"/>
+              <w:left w:type="dxa" w:w="120"/>
+              <w:bottom w:type="dxa" w:w="80"/>
+              <w:right w:type="dxa" w:w="120"/>
+            </w:tcMar>
+          </w:tcPr>
+          <w:p>
+            <w:r>
+              <w:rPr>
+                <w:b/>
+                <w:bCs/>
+              </w:rPr>
+              <w:t xml:space="preserve">Imprimer</w:t>
+            </w:r>
+          </w:p>
+        </w:tc>
+        <w:tc>
+          <w:tcPr>
+            <w:tcW w:type="dxa" w:w="7238"/>
+            <w:tcBorders>
+              <w:top w:val="single" w:color="B9C2D3" w:sz="6"/>
+              <w:left w:val="single" w:color="B9C2D3" w:sz="6"/>
+              <w:bottom w:val="single" w:color="B9C2D3" w:sz="6"/>
+              <w:right w:val="single" w:color="B9C2D3" w:sz="6"/>
+            </w:tcBorders>
+            <w:tcMar>
+              <w:top w:type="dxa" w:w="80"/>
+              <w:left w:type="dxa" w:w="120"/>
+              <w:bottom w:type="dxa" w:w="80"/>
+              <w:right w:type="dxa" w:w="120"/>
+            </w:tcMar>
+          </w:tcPr>
+          <w:p>
+            <w:r>
+              <w:t xml:space="preserve">Sur ordinateur uniquement, pour les PDF et les images : ouvre directement la fenêtre d’impression.</w:t>
+            </w:r>
+          </w:p>
+        </w:tc>
+      </w:tr>
+      <w:tr>
+        <w:tc>
+          <w:tcPr>
+            <w:tcW w:type="dxa" w:w="2400"/>
+            <w:tcBorders>
+              <w:top w:val="single" w:color="B9C2D3" w:sz="6"/>
+              <w:left w:val="single" w:color="B9C2D3" w:sz="6"/>
+              <w:bottom w:val="single" w:color="B9C2D3" w:sz="6"/>
+              <w:right w:val="single" w:color="B9C2D3" w:sz="6"/>
+            </w:tcBorders>
+            <w:tcMar>
+              <w:top w:type="dxa" w:w="80"/>
+              <w:left w:type="dxa" w:w="120"/>
+              <w:bottom w:type="dxa" w:w="80"/>
+              <w:right w:type="dxa" w:w="120"/>
+            </w:tcMar>
+          </w:tcPr>
+          <w:p>
+            <w:r>
+              <w:rPr>
+                <w:b/>
+                <w:bCs/>
+              </w:rPr>
               <w:t xml:space="preserve">Envoyer par mail</w:t>
             </w:r>
           </w:p>
@@ -1756,7 +1856,7 @@
         <w:t xml:space="preserve">Impression.</w:t>
       </w:r>
       <w:r>
-        <w:t xml:space="preserve"> L’imprimante du bureau n’est pas encore reliée aux téléphones : on passe donc par l’envoi par mail. Si elle le devient, on pourra imprimer directement depuis « Ouvrir », par le menu du navigateur.</w:t>
+        <w:t xml:space="preserve"> Sur ordinateur, le bouton Imprimer ouvre directement la fenêtre d’impression. L’imprimante du bureau n’étant pas reliée aux téléphones, on passe sur téléphone par l’envoi par mail ou le téléchargement.</w:t>
       </w:r>
     </w:p>
     <w:p>
@@ -2294,7 +2394,7 @@
         <w:spacing w:after="80" w:line="290"/>
       </w:pPr>
       <w:r>
-        <w:t xml:space="preserve">Commentaire éventuel, formule de contact, signature « Équipe médicale Bus3132 », pied de page (adresse, téléphone, SIRET).</w:t>
+        <w:t xml:space="preserve">Commentaire éventuel, formule de contact, signature « Équipe médicale Bus3132 » et tampon de l’association s’il a été déposé, pied de page (adresse, téléphone, SIRET).</w:t>
       </w:r>
     </w:p>
     <w:p>
@@ -2532,6 +2632,26 @@
       </w:r>
       <w:r>
         <w:t xml:space="preserve"> : les adresses proposées par défaut (la première est présélectionnée).</w:t>
+      </w:r>
+    </w:p>
+    <w:p>
+      <w:pPr>
+        <w:pStyle w:val="ListParagraph"/>
+        <w:numPr>
+          <w:ilvl w:val="0"/>
+          <w:numId w:val="2"/>
+        </w:numPr>
+        <w:spacing w:after="80" w:line="290"/>
+      </w:pPr>
+      <w:r>
+        <w:rPr>
+          <w:b/>
+          <w:bCs/>
+        </w:rPr>
+        <w:t xml:space="preserve">Tampon de l’association</w:t>
+      </w:r>
+      <w:r>
+        <w:t xml:space="preserve"> : image (PNG à fond transparent de préférence) ajoutée sous la signature de chaque attestation. Elle est stockée dans la base, visible des seuls membres connectés.</w:t>
       </w:r>
     </w:p>
     <w:p>
@@ -3354,7 +3474,7 @@
         <w:t xml:space="preserve">Imitation du PDF</w:t>
       </w:r>
       <w:r>
-        <w:t xml:space="preserve"> : le code étant public, un PDF identique peut être fabriqué ; la garantie reste l’adresse de l’expéditeur.</w:t>
+        <w:t xml:space="preserve"> : le tampon, stocké dans la base et réservé aux membres, empêche une personne extérieure de produire facilement une attestation complète. Mais chaque destinataire reçoit ce tampon dans les PDF et pourrait le recopier : la garantie reste l’adresse de l’expéditeur.</w:t>
       </w:r>
     </w:p>
     <w:p>

</xml_diff>